<commit_message>
Corrige recorte del anio en el encabezado del certificado
La caja de texto de «mes_anio» en word/header2.xml era demasiado
angosta y sin wrap visible: meses largos (Septiembre, Noviembre)
perdian el anio en el PDF final. Solo se habia probado con "Julio".
Se ensancho de 123.55pt a 150pt y se redujo la fuente de 12pt a 9pt
en las dos copias del XML (DrawingML + VML fallback), verificado
localmente con LibreOffice contra los dos meses mas largos.

Tambien documenta en CLAUDE.md la excepcion supervisada para
revertir contadores de Supabase tras una prueba deliberada.

Co-Authored-By: Claude Sonnet 5 <noreply@anthropic.com>
</commit_message>
<xml_diff>
--- a/formato de certificado de asistencia.docx
+++ b/formato de certificado de asistencia.docx
@@ -1428,7 +1428,7 @@
               <wp:positionV relativeFrom="paragraph">
                 <wp:posOffset>635</wp:posOffset>
               </wp:positionV>
-              <wp:extent cx="1569085" cy="281940"/>
+              <wp:extent cx="1905000" cy="457200"/>
               <wp:effectExtent l="0" t="0" r="0" b="0"/>
               <wp:wrapSquare wrapText="bothSides"/>
               <wp:docPr id="3" name="Cuadro de texto 2"/>
@@ -1444,7 +1444,7 @@
                     <wps:spPr bwMode="auto">
                       <a:xfrm>
                         <a:off x="0" y="0"/>
-                        <a:ext cx="1569085" cy="281940"/>
+                        <a:ext cx="1905000" cy="457200"/>
                       </a:xfrm>
                       <a:prstGeom prst="rect">
                         <a:avLst/>
@@ -1465,7 +1465,7 @@
                             <w:rPr>
                               <w:rFonts w:ascii="Roboto" w:hAnsi="Roboto" w:cs="Segoe UI Semibold"/>
                               <w:color w:val="2F5496" w:themeColor="accent5" w:themeShade="BF"/>
-                              <w:sz w:val="24"/>
+                              <w:sz w:val="18"/>
                               <w:lang w:val="es-ES"/>
                             </w:rPr>
                           </w:pPr>
@@ -1475,7 +1475,7 @@
                               <w:b/>
                               <w:bCs/>
                               <w:color w:val="2F5496" w:themeColor="accent5" w:themeShade="BF"/>
-                              <w:sz w:val="24"/>
+                              <w:sz w:val="18"/>
                             </w:rPr>
                             <w:t>«</w:t>
                           </w:r>
@@ -1486,7 +1486,7 @@
                               <w:b/>
                               <w:bCs/>
                               <w:color w:val="2F5496" w:themeColor="accent5" w:themeShade="BF"/>
-                              <w:sz w:val="24"/>
+                              <w:sz w:val="18"/>
                             </w:rPr>
                             <w:t>mes_anio</w:t>
                           </w:r>
@@ -1497,7 +1497,7 @@
                               <w:b/>
                               <w:bCs/>
                               <w:color w:val="2F5496" w:themeColor="accent5" w:themeShade="BF"/>
-                              <w:sz w:val="24"/>
+                              <w:sz w:val="18"/>
                             </w:rPr>
                             <w:t>»</w:t>
                           </w:r>
@@ -1525,7 +1525,7 @@
               <v:stroke joinstyle="miter"/>
               <v:path gradientshapeok="t" o:connecttype="rect"/>
             </v:shapetype>
-            <v:shape id="_x0000_s1031" type="#_x0000_t202" style="position:absolute;margin-left:606.45pt;margin-top:.05pt;width:123.55pt;height:22.2pt;z-index:251661312;visibility:visible;mso-wrap-style:square;mso-width-percent:0;mso-height-percent:0;mso-wrap-distance-left:9pt;mso-wrap-distance-top:3.6pt;mso-wrap-distance-right:9pt;mso-wrap-distance-bottom:3.6pt;mso-position-horizontal:absolute;mso-position-horizontal-relative:text;mso-position-vertical:absolute;mso-position-vertical-relative:text;mso-width-percent:0;mso-height-percent:0;mso-width-relative:margin;mso-height-relative:margin;v-text-anchor:top" o:gfxdata="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" filled="f" stroked="f">
+            <v:shape id="_x0000_s1031" type="#_x0000_t202" style="position:absolute;margin-left:606.45pt;margin-top:.05pt;width:150pt;height:36pt;z-index:251661312;visibility:visible;mso-wrap-style:square;mso-width-percent:0;mso-height-percent:0;mso-wrap-distance-left:9pt;mso-wrap-distance-top:3.6pt;mso-wrap-distance-right:9pt;mso-wrap-distance-bottom:3.6pt;mso-position-horizontal:absolute;mso-position-horizontal-relative:text;mso-position-vertical:absolute;mso-position-vertical-relative:text;mso-width-percent:0;mso-height-percent:0;mso-width-relative:margin;mso-height-relative:margin;v-text-anchor:top" o:gfxdata="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" filled="f" stroked="f">
               <v:textbox>
                 <w:txbxContent>
                   <w:p>
@@ -1534,7 +1534,7 @@
                       <w:rPr>
                         <w:rFonts w:ascii="Roboto" w:hAnsi="Roboto" w:cs="Segoe UI Semibold"/>
                         <w:color w:val="2F5496" w:themeColor="accent5" w:themeShade="BF"/>
-                        <w:sz w:val="24"/>
+                        <w:sz w:val="18"/>
                         <w:lang w:val="es-ES"/>
                       </w:rPr>
                     </w:pPr>
@@ -1544,7 +1544,7 @@
                         <w:b/>
                         <w:bCs/>
                         <w:color w:val="2F5496" w:themeColor="accent5" w:themeShade="BF"/>
-                        <w:sz w:val="24"/>
+                        <w:sz w:val="18"/>
                       </w:rPr>
                       <w:t>«</w:t>
                     </w:r>
@@ -1555,7 +1555,7 @@
                         <w:b/>
                         <w:bCs/>
                         <w:color w:val="2F5496" w:themeColor="accent5" w:themeShade="BF"/>
-                        <w:sz w:val="24"/>
+                        <w:sz w:val="18"/>
                       </w:rPr>
                       <w:t>mes_anio</w:t>
                     </w:r>
@@ -1566,7 +1566,7 @@
                         <w:b/>
                         <w:bCs/>
                         <w:color w:val="2F5496" w:themeColor="accent5" w:themeShade="BF"/>
-                        <w:sz w:val="24"/>
+                        <w:sz w:val="18"/>
                       </w:rPr>
                       <w:t>»</w:t>
                     </w:r>

</xml_diff>